<commit_message>
Corrige pseudocodigo do dual_momentum (regenerado para as linhas novas)
Co-Authored-By: Claude Opus 4.8 <noreply@anthropic.com>
</commit_message>
<xml_diff>
--- a/Pseudocodigo_DualMomentum.docx
+++ b/Pseudocodigo_DualMomentum.docx
@@ -482,7 +482,28 @@
           <w:sz w:val="18"/>
           <w:szCs w:val="18"/>
         </w:rPr>
-        <w:t xml:space="preserve">Calculo o drawdown: patrimônio sobre o seu máximo até ali, menos um.</w:t>
+        <w:t xml:space="preserve">Calculo o Sharpe: média sobre desvio, anualizado por raiz de 12.</w:t>
+      </w:r>
+    </w:p>
+    <w:p>
+      <w:pPr>
+        <w:spacing w:after="40"/>
+      </w:pPr>
+      <w:r>
+        <w:rPr>
+          <w:b/>
+          <w:bCs/>
+          <w:sz w:val="18"/>
+          <w:szCs w:val="18"/>
+        </w:rPr>
+        <w:t xml:space="preserve">44 — </w:t>
+      </w:r>
+      <w:r>
+        <w:rPr>
+          <w:sz w:val="18"/>
+          <w:szCs w:val="18"/>
+        </w:rPr>
+        <w:t xml:space="preserve">Calculo o drawdown máximo: mínimo do patrimônio sobre o seu máximo até ali, menos um.</w:t>
       </w:r>
     </w:p>
     <w:p>
@@ -503,6 +524,90 @@
           <w:sz w:val="18"/>
           <w:szCs w:val="18"/>
         </w:rPr>
+        <w:t xml:space="preserve">Calculo o retorno total.</w:t>
+      </w:r>
+    </w:p>
+    <w:p>
+      <w:pPr>
+        <w:spacing w:after="40"/>
+      </w:pPr>
+      <w:r>
+        <w:rPr>
+          <w:b/>
+          <w:bCs/>
+          <w:sz w:val="18"/>
+          <w:szCs w:val="18"/>
+        </w:rPr>
+        <w:t xml:space="preserve">46 — </w:t>
+      </w:r>
+      <w:r>
+        <w:rPr>
+          <w:sz w:val="18"/>
+          <w:szCs w:val="18"/>
+        </w:rPr>
+        <w:t xml:space="preserve">Meço o tempo em caixa: em quantos % dos meses a carteira ficou 100% no CDI.</w:t>
+      </w:r>
+    </w:p>
+    <w:p>
+      <w:pPr>
+        <w:spacing w:after="40"/>
+      </w:pPr>
+      <w:r>
+        <w:rPr>
+          <w:b/>
+          <w:bCs/>
+          <w:sz w:val="18"/>
+          <w:szCs w:val="18"/>
+        </w:rPr>
+        <w:t xml:space="preserve">47 — </w:t>
+      </w:r>
+      <w:r>
+        <w:rPr>
+          <w:sz w:val="18"/>
+          <w:szCs w:val="18"/>
+        </w:rPr>
+        <w:t xml:space="preserve">Conto as trocas de posição.</w:t>
+      </w:r>
+    </w:p>
+    <w:p>
+      <w:pPr>
+        <w:spacing w:after="40"/>
+      </w:pPr>
+      <w:r>
+        <w:rPr>
+          <w:b/>
+          <w:bCs/>
+          <w:sz w:val="18"/>
+          <w:szCs w:val="18"/>
+        </w:rPr>
+        <w:t xml:space="preserve">48 — </w:t>
+      </w:r>
+      <w:r>
+        <w:rPr>
+          <w:sz w:val="18"/>
+          <w:szCs w:val="18"/>
+        </w:rPr>
+        <w:t xml:space="preserve">Guardo a posição de hoje: o líder atual, ou CAIXA se a perna absoluta mandar sair.</w:t>
+      </w:r>
+    </w:p>
+    <w:p>
+      <w:pPr>
+        <w:spacing w:after="40"/>
+      </w:pPr>
+      <w:r>
+        <w:rPr>
+          <w:b/>
+          <w:bCs/>
+          <w:sz w:val="18"/>
+          <w:szCs w:val="18"/>
+        </w:rPr>
+        <w:t xml:space="preserve">50 — </w:t>
+      </w:r>
+      <w:r>
+        <w:rPr>
+          <w:sz w:val="18"/>
+          <w:szCs w:val="18"/>
+        </w:rPr>
         <w:t xml:space="preserve">Imprimo o título.</w:t>
       </w:r>
     </w:p>
@@ -517,7 +622,7 @@
           <w:sz w:val="18"/>
           <w:szCs w:val="18"/>
         </w:rPr>
-        <w:t xml:space="preserve">46 — </w:t>
+        <w:t xml:space="preserve">51 — </w:t>
       </w:r>
       <w:r>
         <w:rPr>
@@ -538,90 +643,6 @@
           <w:sz w:val="18"/>
           <w:szCs w:val="18"/>
         </w:rPr>
-        <w:t xml:space="preserve">47 — </w:t>
-      </w:r>
-      <w:r>
-        <w:rPr>
-          <w:sz w:val="18"/>
-          <w:szCs w:val="18"/>
-        </w:rPr>
-        <w:t xml:space="preserve">Imprimo o Sharpe (média sobre desvio, anualizado por raiz de 12).</w:t>
-      </w:r>
-    </w:p>
-    <w:p>
-      <w:pPr>
-        <w:spacing w:after="40"/>
-      </w:pPr>
-      <w:r>
-        <w:rPr>
-          <w:b/>
-          <w:bCs/>
-          <w:sz w:val="18"/>
-          <w:szCs w:val="18"/>
-        </w:rPr>
-        <w:t xml:space="preserve">48 — </w:t>
-      </w:r>
-      <w:r>
-        <w:rPr>
-          <w:sz w:val="18"/>
-          <w:szCs w:val="18"/>
-        </w:rPr>
-        <w:t xml:space="preserve">Imprimo o drawdown máximo (régua mensal; na diária é mais fundo).</w:t>
-      </w:r>
-    </w:p>
-    <w:p>
-      <w:pPr>
-        <w:spacing w:after="40"/>
-      </w:pPr>
-      <w:r>
-        <w:rPr>
-          <w:b/>
-          <w:bCs/>
-          <w:sz w:val="18"/>
-          <w:szCs w:val="18"/>
-        </w:rPr>
-        <w:t xml:space="preserve">49 — </w:t>
-      </w:r>
-      <w:r>
-        <w:rPr>
-          <w:sz w:val="18"/>
-          <w:szCs w:val="18"/>
-        </w:rPr>
-        <w:t xml:space="preserve">Imprimo o retorno total.</w:t>
-      </w:r>
-    </w:p>
-    <w:p>
-      <w:pPr>
-        <w:spacing w:after="40"/>
-      </w:pPr>
-      <w:r>
-        <w:rPr>
-          <w:b/>
-          <w:bCs/>
-          <w:sz w:val="18"/>
-          <w:szCs w:val="18"/>
-        </w:rPr>
-        <w:t xml:space="preserve">50–51 — </w:t>
-      </w:r>
-      <w:r>
-        <w:rPr>
-          <w:sz w:val="18"/>
-          <w:szCs w:val="18"/>
-        </w:rPr>
-        <w:t xml:space="preserve">Imprimo o tempo em caixa e o número de trocas.</w:t>
-      </w:r>
-    </w:p>
-    <w:p>
-      <w:pPr>
-        <w:spacing w:after="40"/>
-      </w:pPr>
-      <w:r>
-        <w:rPr>
-          <w:b/>
-          <w:bCs/>
-          <w:sz w:val="18"/>
-          <w:szCs w:val="18"/>
-        </w:rPr>
         <w:t xml:space="preserve">52 — </w:t>
       </w:r>
       <w:r>
@@ -629,7 +650,28 @@
           <w:sz w:val="18"/>
           <w:szCs w:val="18"/>
         </w:rPr>
-        <w:t xml:space="preserve">Imprimo a posição de hoje: o líder atual, ou CAIXA se a perna absoluta mandar sair.</w:t>
+        <w:t xml:space="preserve">Imprimo Sharpe, drawdown máximo (com o aviso: régua mensal; na diária é mais fundo) e o retorno total.</w:t>
+      </w:r>
+    </w:p>
+    <w:p>
+      <w:pPr>
+        <w:spacing w:after="40"/>
+      </w:pPr>
+      <w:r>
+        <w:rPr>
+          <w:b/>
+          <w:bCs/>
+          <w:sz w:val="18"/>
+          <w:szCs w:val="18"/>
+        </w:rPr>
+        <w:t xml:space="preserve">53 — </w:t>
+      </w:r>
+      <w:r>
+        <w:rPr>
+          <w:sz w:val="18"/>
+          <w:szCs w:val="18"/>
+        </w:rPr>
+        <w:t xml:space="preserve">Imprimo o tempo em caixa, as trocas e a posição de hoje.</w:t>
       </w:r>
     </w:p>
     <w:sectPr>

</xml_diff>